<commit_message>
feat(cover-letter): update tailor prompt to body-only generation
Rule 21 now instructs the LLM to generate ONLY the cover letter body
(starting with "Dear Hiring Manager," ending before "Sincerely,") — no
name, contact info, date, or signature. These are now added deterministically
by build_cover_letter() from the candidate profile. Also added rules 22-26
for company/role mention, tone, forbidden content, and output format.

Also updates the cover letter DOCX template.

Co-Authored-By: Claude Sonnet 4.6 <noreply@anthropic.com>
</commit_message>
<xml_diff>
--- a/templates/Leonid_Verman_Cover_Letter_Template.docx
+++ b/templates/Leonid_Verman_Cover_Letter_Template.docx
@@ -1,218 +1,123 @@
 
 <file path=word/document.xml><?xml version="1.0" encoding="utf-8"?>
-<w:document xmlns:wpc="http://schemas.microsoft.com/office/word/2010/wordprocessingCanvas" xmlns:cx="http://schemas.microsoft.com/office/drawing/2014/chartex" xmlns:cx1="http://schemas.microsoft.com/office/drawing/2015/9/8/chartex" xmlns:cx2="http://schemas.microsoft.com/office/drawing/2015/10/21/chartex" xmlns:cx3="http://schemas.microsoft.com/office/drawing/2016/5/9/chartex" xmlns:cx4="http://schemas.microsoft.com/office/drawing/2016/5/10/chartex" xmlns:cx5="http://schemas.microsoft.com/office/drawing/2016/5/11/chartex" xmlns:cx6="http://schemas.microsoft.com/office/drawing/2016/5/12/chartex" xmlns:cx7="http://schemas.microsoft.com/office/drawing/2016/5/13/chartex" xmlns:cx8="http://schemas.microsoft.com/office/drawing/2016/5/14/chartex" xmlns:mc="http://schemas.openxmlformats.org/markup-compatibility/2006" xmlns:aink="http://schemas.microsoft.com/office/drawing/2016/ink" xmlns:am3d="http://schemas.microsoft.com/office/drawing/2017/model3d" xmlns:o="urn:schemas-microsoft-com:office:office" xmlns:r="http://schemas.openxmlformats.org/officeDocument/2006/relationships" xmlns:m="http://schemas.openxmlformats.org/officeDocument/2006/math" xmlns:v="urn:schemas-microsoft-com:vml" xmlns:wp14="http://schemas.microsoft.com/office/word/2010/wordprocessingDrawing" xmlns:wp="http://schemas.openxmlformats.org/drawingml/2006/wordprocessingDrawing" xmlns:w10="urn:schemas-microsoft-com:office:word" xmlns:w="http://schemas.openxmlformats.org/wordprocessingml/2006/main" xmlns:w14="http://schemas.microsoft.com/office/word/2010/wordml" xmlns:w15="http://schemas.microsoft.com/office/word/2012/wordml" xmlns:w16cex="http://schemas.microsoft.com/office/word/2018/wordml/cex" xmlns:w16cid="http://schemas.microsoft.com/office/word/2016/wordml/cid" xmlns:w16="http://schemas.microsoft.com/office/word/2018/wordml" xmlns:w16sdtdh="http://schemas.microsoft.com/office/word/2020/wordml/sdtdatahash" xmlns:w16se="http://schemas.microsoft.com/office/word/2015/wordml/symex" xmlns:wpg="http://schemas.microsoft.com/office/word/2010/wordprocessingGroup" xmlns:wpi="http://schemas.microsoft.com/office/word/2010/wordprocessingInk" xmlns:wne="http://schemas.microsoft.com/office/word/2006/wordml" xmlns:wps="http://schemas.microsoft.com/office/word/2010/wordprocessingShape" mc:Ignorable="w14 w15 w16se w16cid w16 w16cex w16sdtdh wp14">
+<w:document xmlns:o="urn:schemas-microsoft-com:office:office" xmlns:r="http://schemas.openxmlformats.org/officeDocument/2006/relationships" xmlns:v="urn:schemas-microsoft-com:vml" xmlns:w="http://schemas.openxmlformats.org/wordprocessingml/2006/main" xmlns:w10="urn:schemas-microsoft-com:office:word" xmlns:wp="http://schemas.openxmlformats.org/drawingml/2006/wordprocessingDrawing" xmlns:pic="http://schemas.openxmlformats.org/drawingml/2006/picture" xmlns:wps="http://schemas.microsoft.com/office/word/2010/wordprocessingShape" xmlns:wpg="http://schemas.microsoft.com/office/word/2010/wordprocessingGroup" xmlns:mc="http://schemas.openxmlformats.org/markup-compatibility/2006" xmlns:wp14="http://schemas.microsoft.com/office/word/2010/wordprocessingDrawing" xmlns:w14="http://schemas.microsoft.com/office/word/2010/wordml" xmlns:w15="http://schemas.microsoft.com/office/word/2012/wordml" mc:Ignorable="w14 wp14 w15">
   <w:body>
     <w:p>
       <w:pPr>
         <w:pStyle w:val="BodyText"/>
-        <w:rPr>
-          <w:lang w:val="en-CA"/>
-        </w:rPr>
+        <w:rPr/>
       </w:pPr>
       <w:r>
-        <w:rPr>
-          <w:rStyle w:val="Strong"/>
-        </w:rPr>
-        <w:t>Leonid Verman</w:t>
-      </w:r>
-      <w:r>
-        <w:br/>
-        <w:t xml:space="preserve">Vancouver, BC, Canada · +1 (778) 317-3248 · </w:t>
-      </w:r>
-      <w:hyperlink r:id="rId5" w:history="1">
-        <w:r>
-          <w:rPr>
-            <w:rStyle w:val="Hyperlink"/>
-          </w:rPr>
-          <w:t>leonidverman@gmail.com</w:t>
-        </w:r>
-      </w:hyperlink>
-    </w:p>
-    <w:p>
-      <w:pPr>
-        <w:pStyle w:val="BodyText"/>
-        <w:rPr>
-          <w:lang w:val="en-CA"/>
-        </w:rPr>
-      </w:pPr>
-      <w:r>
-        <w:rPr>
-          <w:lang w:val="en-CA"/>
-        </w:rPr>
-        <w:t>https://www.linkedin.com/in/leonid-verman-3569b71b2/</w:t>
-      </w:r>
-    </w:p>
-    <w:p>
-      <w:pPr>
-        <w:pStyle w:val="BodyText"/>
-      </w:pPr>
-      <w:r>
-        <w:rPr>
-          <w:lang w:val="en-CA"/>
-        </w:rPr>
-        <w:t>February 16</w:t>
-      </w:r>
-      <w:r>
-        <w:rPr>
-          <w:vertAlign w:val="superscript"/>
-          <w:lang w:val="en-CA"/>
-        </w:rPr>
-        <w:t>h</w:t>
-      </w:r>
-      <w:r>
-        <w:rPr>
-          <w:lang w:val="en-CA"/>
-        </w:rPr>
-        <w:t>, 2026</w:t>
-      </w:r>
-    </w:p>
-    <w:p>
-      <w:pPr>
-        <w:pStyle w:val="BodyText"/>
-      </w:pPr>
-      <w:r>
+        <w:rPr/>
         <w:t>Dear Hiring Manager,</w:t>
       </w:r>
     </w:p>
     <w:p>
       <w:pPr>
         <w:pStyle w:val="BodyText"/>
+        <w:rPr/>
       </w:pPr>
       <w:r>
-        <w:t>I am excited to apply for the Senior</w:t>
-      </w:r>
-      <w:r>
-        <w:t xml:space="preserve"> Software Engineer </w:t>
-      </w:r>
-      <w:r>
-        <w:rPr>
-          <w:lang w:val="en-CA"/>
-        </w:rPr>
-        <w:t>role at Tigera</w:t>
-      </w:r>
-      <w:r>
-        <w:t xml:space="preserve">. With </w:t>
-      </w:r>
-      <w:r>
-        <w:rPr>
-          <w:lang w:val="en-CA"/>
-        </w:rPr>
-        <w:t>over 15</w:t>
-      </w:r>
-      <w:r>
-        <w:t xml:space="preserve"> years of experience in backend engineering and team leadership, including roles as VP and Director of Software Development, </w:t>
-      </w:r>
-      <w:r>
-        <w:rPr>
-          <w:lang w:val="en-CA"/>
-        </w:rPr>
-        <w:t>I have built fintech and blockchain systems that became top-5 platforms in the Japan</w:t>
-      </w:r>
-      <w:r>
-        <w:rPr>
-          <w:lang w:val="en-CA"/>
-        </w:rPr>
-        <w:t>ese market, serving over 1M users, and led teams of up to 20 engineers to deliver reliable, scalable products.</w:t>
+        <w:rPr/>
       </w:r>
     </w:p>
     <w:p>
       <w:pPr>
         <w:pStyle w:val="BodyText"/>
+        <w:rPr/>
       </w:pPr>
       <w:r>
-        <w:t xml:space="preserve">In addition to my industry work, I currently contribute as an independent contractor supporting </w:t>
-      </w:r>
-      <w:r>
-        <w:rPr>
-          <w:lang w:val="en-CA"/>
-        </w:rPr>
-        <w:t>world-</w:t>
-      </w:r>
-      <w:r>
-        <w:t>leading AI research labs in training and ev</w:t>
-      </w:r>
-      <w:r>
-        <w:t>aluating advanced AI models on senior-level software engineering tasks. This work keeps me deeply engaged with cutting-edge development practices, reinforces my ability to solve complex problems under ambiguity, and strengthens my proficiency with AI-assis</w:t>
-      </w:r>
-      <w:r>
-        <w:t xml:space="preserve">ted development tools. I also adopt AI-accelerated workflows (ChatGPT, </w:t>
-      </w:r>
-      <w:r>
-        <w:rPr>
-          <w:lang w:val="en-US"/>
-        </w:rPr>
-        <w:t xml:space="preserve">Claude, </w:t>
-      </w:r>
-      <w:r>
-        <w:t xml:space="preserve">Cursor </w:t>
-      </w:r>
-      <w:r>
-        <w:rPr>
-          <w:lang w:val="en-US"/>
-        </w:rPr>
-        <w:t>AI</w:t>
-      </w:r>
-      <w:r>
-        <w:t>) to improve productivity, code quality, and architectural clarity.</w:t>
+        <w:rPr/>
+        <w:t>I am excited to apply for the [Role] role at [Company].</w:t>
       </w:r>
     </w:p>
     <w:p>
       <w:pPr>
         <w:pStyle w:val="BodyText"/>
+        <w:rPr/>
       </w:pPr>
       <w:r>
-        <w:t>I would welcome the chance to bring this expertise to your team and contribute to building reliable,</w:t>
-      </w:r>
-      <w:r>
-        <w:t xml:space="preserve"> scalable systems for your clients. I hold Canadian citizenship and am fully eligible to work in Canada.</w:t>
+        <w:rPr/>
       </w:r>
     </w:p>
     <w:p>
       <w:pPr>
         <w:pStyle w:val="BodyText"/>
+        <w:rPr/>
       </w:pPr>
       <w:r>
+        <w:rPr/>
+        <w:t>[2-3 short paragraphs connecting candidate background to role/company needs.]</w:t>
+      </w:r>
+    </w:p>
+    <w:p>
+      <w:pPr>
+        <w:pStyle w:val="BodyText"/>
+        <w:rPr/>
+      </w:pPr>
+      <w:r>
+        <w:rPr/>
+      </w:r>
+    </w:p>
+    <w:p>
+      <w:pPr>
+        <w:pStyle w:val="BodyText"/>
+        <w:rPr/>
+      </w:pPr>
+      <w:r>
+        <w:rPr/>
         <w:t>Thank you for your time and consideration.</w:t>
       </w:r>
     </w:p>
     <w:p>
       <w:pPr>
         <w:pStyle w:val="BodyText"/>
-      </w:pPr>
+        <w:rPr/>
+      </w:pPr>
+      <w:r>
+        <w:rPr/>
+      </w:r>
     </w:p>
     <w:p>
       <w:pPr>
         <w:pStyle w:val="BodyText"/>
+        <w:rPr/>
       </w:pPr>
       <w:r>
+        <w:rPr/>
         <w:t>Sincerely,</w:t>
-      </w:r>
-      <w:r>
         <w:br/>
         <w:t>Leonid Verman</w:t>
       </w:r>
     </w:p>
-    <w:p/>
+    <w:p>
+      <w:pPr>
+        <w:pStyle w:val="Normal"/>
+        <w:rPr/>
+      </w:pPr>
+      <w:r>
+        <w:rPr/>
+      </w:r>
+    </w:p>
     <w:sectPr>
+      <w:type w:val="nextPage"/>
       <w:pgSz w:w="11906" w:h="16838"/>
-      <w:pgMar w:top="1134" w:right="1134" w:bottom="1134" w:left="1134" w:header="720" w:footer="720" w:gutter="0"/>
-      <w:cols w:space="720"/>
-      <w:docGrid w:linePitch="600" w:charSpace="32768"/>
+      <w:pgMar w:left="1134" w:right="1134" w:gutter="0" w:header="0" w:top="1134" w:footer="0" w:bottom="1134"/>
+      <w:pgNumType w:fmt="decimal"/>
+      <w:formProt w:val="false"/>
+      <w:textDirection w:val="lrTb"/>
+      <w:docGrid w:type="default" w:linePitch="600" w:charSpace="32768"/>
     </w:sectPr>
   </w:body>
 </w:document>
 </file>
 
 <file path=word/numbering.xml><?xml version="1.0" encoding="utf-8"?>
-<w:numbering xmlns:wpc="http://schemas.microsoft.com/office/word/2010/wordprocessingCanvas" xmlns:cx="http://schemas.microsoft.com/office/drawing/2014/chartex" xmlns:cx1="http://schemas.microsoft.com/office/drawing/2015/9/8/chartex" xmlns:cx2="http://schemas.microsoft.com/office/drawing/2015/10/21/chartex" xmlns:cx3="http://schemas.microsoft.com/office/drawing/2016/5/9/chartex" xmlns:cx4="http://schemas.microsoft.com/office/drawing/2016/5/10/chartex" xmlns:cx5="http://schemas.microsoft.com/office/drawing/2016/5/11/chartex" xmlns:cx6="http://schemas.microsoft.com/office/drawing/2016/5/12/chartex" xmlns:cx7="http://schemas.microsoft.com/office/drawing/2016/5/13/chartex" xmlns:cx8="http://schemas.microsoft.com/office/drawing/2016/5/14/chartex" xmlns:mc="http://schemas.openxmlformats.org/markup-compatibility/2006" xmlns:aink="http://schemas.microsoft.com/office/drawing/2016/ink" xmlns:am3d="http://schemas.microsoft.com/office/drawing/2017/model3d" xmlns:o="urn:schemas-microsoft-com:office:office" xmlns:r="http://schemas.openxmlformats.org/officeDocument/2006/relationships" xmlns:m="http://schemas.openxmlformats.org/officeDocument/2006/math" xmlns:v="urn:schemas-microsoft-com:vml" xmlns:wp14="http://schemas.microsoft.com/office/word/2010/wordprocessingDrawing" xmlns:wp="http://schemas.openxmlformats.org/drawingml/2006/wordprocessingDrawing" xmlns:w10="urn:schemas-microsoft-com:office:word" xmlns:w="http://schemas.openxmlformats.org/wordprocessingml/2006/main" xmlns:w14="http://schemas.microsoft.com/office/word/2010/wordml" xmlns:w15="http://schemas.microsoft.com/office/word/2012/wordml" xmlns:w16cex="http://schemas.microsoft.com/office/word/2018/wordml/cex" xmlns:w16cid="http://schemas.microsoft.com/office/word/2016/wordml/cid" xmlns:w16="http://schemas.microsoft.com/office/word/2018/wordml" xmlns:w16sdtdh="http://schemas.microsoft.com/office/word/2020/wordml/sdtdatahash" xmlns:w16se="http://schemas.microsoft.com/office/word/2015/wordml/symex" xmlns:wpg="http://schemas.microsoft.com/office/word/2010/wordprocessingGroup" xmlns:wpi="http://schemas.microsoft.com/office/word/2010/wordprocessingInk" xmlns:wne="http://schemas.microsoft.com/office/word/2006/wordml" xmlns:wps="http://schemas.microsoft.com/office/word/2010/wordprocessingShape" mc:Ignorable="w14 w15 w16se w16cid w16 w16cex w16sdtdh wp14">
-  <w:abstractNum w:abstractNumId="0" w15:restartNumberingAfterBreak="0">
-    <w:nsid w:val="00000001"/>
-    <w:multiLevelType w:val="multilevel"/>
-    <w:tmpl w:val="00000001"/>
+<w:numbering xmlns:w="http://schemas.openxmlformats.org/wordprocessingml/2006/main" xmlns:o="urn:schemas-microsoft-com:office:office" xmlns:r="http://schemas.openxmlformats.org/officeDocument/2006/relationships" xmlns:v="urn:schemas-microsoft-com:vml" xmlns:mc="http://schemas.openxmlformats.org/markup-compatibility/2006" xmlns:w14="http://schemas.microsoft.com/office/word/2010/wordml" mc:Ignorable="w14">
+  <w:abstractNum w:abstractNumId="1">
     <w:lvl w:ilvl="0">
       <w:start w:val="1"/>
       <w:numFmt w:val="none"/>
-      <w:pStyle w:val="Heading1"/>
       <w:suff w:val="nothing"/>
       <w:lvlText w:val=""/>
       <w:lvlJc w:val="left"/>
@@ -222,6 +127,7 @@
         </w:tabs>
         <w:ind w:left="432" w:hanging="432"/>
       </w:pPr>
+      <w:rPr/>
     </w:lvl>
     <w:lvl w:ilvl="1">
       <w:start w:val="1"/>
@@ -231,10 +137,11 @@
       <w:lvlJc w:val="left"/>
       <w:pPr>
         <w:tabs>
-          <w:tab w:val="num" w:pos="576"/>
+          <w:tab w:val="num" w:pos="0"/>
         </w:tabs>
         <w:ind w:left="576" w:hanging="576"/>
       </w:pPr>
+      <w:rPr/>
     </w:lvl>
     <w:lvl w:ilvl="2">
       <w:start w:val="1"/>
@@ -244,10 +151,11 @@
       <w:lvlJc w:val="left"/>
       <w:pPr>
         <w:tabs>
-          <w:tab w:val="num" w:pos="720"/>
+          <w:tab w:val="num" w:pos="0"/>
         </w:tabs>
         <w:ind w:left="720" w:hanging="720"/>
       </w:pPr>
+      <w:rPr/>
     </w:lvl>
     <w:lvl w:ilvl="3">
       <w:start w:val="1"/>
@@ -257,10 +165,11 @@
       <w:lvlJc w:val="left"/>
       <w:pPr>
         <w:tabs>
-          <w:tab w:val="num" w:pos="864"/>
+          <w:tab w:val="num" w:pos="0"/>
         </w:tabs>
         <w:ind w:left="864" w:hanging="864"/>
       </w:pPr>
+      <w:rPr/>
     </w:lvl>
     <w:lvl w:ilvl="4">
       <w:start w:val="1"/>
@@ -270,10 +179,11 @@
       <w:lvlJc w:val="left"/>
       <w:pPr>
         <w:tabs>
-          <w:tab w:val="num" w:pos="1008"/>
+          <w:tab w:val="num" w:pos="0"/>
         </w:tabs>
         <w:ind w:left="1008" w:hanging="1008"/>
       </w:pPr>
+      <w:rPr/>
     </w:lvl>
     <w:lvl w:ilvl="5">
       <w:start w:val="1"/>
@@ -283,10 +193,11 @@
       <w:lvlJc w:val="left"/>
       <w:pPr>
         <w:tabs>
-          <w:tab w:val="num" w:pos="1152"/>
+          <w:tab w:val="num" w:pos="0"/>
         </w:tabs>
         <w:ind w:left="1152" w:hanging="1152"/>
       </w:pPr>
+      <w:rPr/>
     </w:lvl>
     <w:lvl w:ilvl="6">
       <w:start w:val="1"/>
@@ -296,10 +207,11 @@
       <w:lvlJc w:val="left"/>
       <w:pPr>
         <w:tabs>
-          <w:tab w:val="num" w:pos="1296"/>
+          <w:tab w:val="num" w:pos="0"/>
         </w:tabs>
         <w:ind w:left="1296" w:hanging="1296"/>
       </w:pPr>
+      <w:rPr/>
     </w:lvl>
     <w:lvl w:ilvl="7">
       <w:start w:val="1"/>
@@ -309,10 +221,11 @@
       <w:lvlJc w:val="left"/>
       <w:pPr>
         <w:tabs>
-          <w:tab w:val="num" w:pos="1440"/>
+          <w:tab w:val="num" w:pos="0"/>
         </w:tabs>
         <w:ind w:left="1440" w:hanging="1440"/>
       </w:pPr>
+      <w:rPr/>
     </w:lvl>
     <w:lvl w:ilvl="8">
       <w:start w:val="1"/>
@@ -322,40 +235,167 @@
       <w:lvlJc w:val="left"/>
       <w:pPr>
         <w:tabs>
-          <w:tab w:val="num" w:pos="1584"/>
+          <w:tab w:val="num" w:pos="0"/>
         </w:tabs>
         <w:ind w:left="1584" w:hanging="1584"/>
+      </w:pPr>
+      <w:rPr/>
+    </w:lvl>
+  </w:abstractNum>
+  <w:abstractNum w:abstractNumId="2">
+    <w:lvl w:ilvl="0">
+      <w:start w:val="1"/>
+      <w:numFmt w:val="none"/>
+      <w:suff w:val="nothing"/>
+      <w:lvlText w:val=""/>
+      <w:lvlJc w:val="left"/>
+      <w:pPr>
+        <w:tabs>
+          <w:tab w:val="num" w:pos="0"/>
+        </w:tabs>
+        <w:ind w:left="0" w:hanging="0"/>
+      </w:pPr>
+    </w:lvl>
+    <w:lvl w:ilvl="1">
+      <w:start w:val="1"/>
+      <w:numFmt w:val="none"/>
+      <w:suff w:val="nothing"/>
+      <w:lvlText w:val=""/>
+      <w:lvlJc w:val="left"/>
+      <w:pPr>
+        <w:tabs>
+          <w:tab w:val="num" w:pos="0"/>
+        </w:tabs>
+        <w:ind w:left="0" w:hanging="0"/>
+      </w:pPr>
+    </w:lvl>
+    <w:lvl w:ilvl="2">
+      <w:start w:val="1"/>
+      <w:numFmt w:val="none"/>
+      <w:suff w:val="nothing"/>
+      <w:lvlText w:val=""/>
+      <w:lvlJc w:val="left"/>
+      <w:pPr>
+        <w:tabs>
+          <w:tab w:val="num" w:pos="0"/>
+        </w:tabs>
+        <w:ind w:left="0" w:hanging="0"/>
+      </w:pPr>
+    </w:lvl>
+    <w:lvl w:ilvl="3">
+      <w:start w:val="1"/>
+      <w:numFmt w:val="none"/>
+      <w:suff w:val="nothing"/>
+      <w:lvlText w:val=""/>
+      <w:lvlJc w:val="left"/>
+      <w:pPr>
+        <w:tabs>
+          <w:tab w:val="num" w:pos="0"/>
+        </w:tabs>
+        <w:ind w:left="0" w:hanging="0"/>
+      </w:pPr>
+    </w:lvl>
+    <w:lvl w:ilvl="4">
+      <w:start w:val="1"/>
+      <w:numFmt w:val="none"/>
+      <w:suff w:val="nothing"/>
+      <w:lvlText w:val=""/>
+      <w:lvlJc w:val="left"/>
+      <w:pPr>
+        <w:tabs>
+          <w:tab w:val="num" w:pos="0"/>
+        </w:tabs>
+        <w:ind w:left="0" w:hanging="0"/>
+      </w:pPr>
+    </w:lvl>
+    <w:lvl w:ilvl="5">
+      <w:start w:val="1"/>
+      <w:numFmt w:val="none"/>
+      <w:suff w:val="nothing"/>
+      <w:lvlText w:val=""/>
+      <w:lvlJc w:val="left"/>
+      <w:pPr>
+        <w:tabs>
+          <w:tab w:val="num" w:pos="0"/>
+        </w:tabs>
+        <w:ind w:left="0" w:hanging="0"/>
+      </w:pPr>
+    </w:lvl>
+    <w:lvl w:ilvl="6">
+      <w:start w:val="1"/>
+      <w:numFmt w:val="none"/>
+      <w:suff w:val="nothing"/>
+      <w:lvlText w:val=""/>
+      <w:lvlJc w:val="left"/>
+      <w:pPr>
+        <w:tabs>
+          <w:tab w:val="num" w:pos="0"/>
+        </w:tabs>
+        <w:ind w:left="0" w:hanging="0"/>
+      </w:pPr>
+    </w:lvl>
+    <w:lvl w:ilvl="7">
+      <w:start w:val="1"/>
+      <w:numFmt w:val="none"/>
+      <w:suff w:val="nothing"/>
+      <w:lvlText w:val=""/>
+      <w:lvlJc w:val="left"/>
+      <w:pPr>
+        <w:tabs>
+          <w:tab w:val="num" w:pos="0"/>
+        </w:tabs>
+        <w:ind w:left="0" w:hanging="0"/>
+      </w:pPr>
+    </w:lvl>
+    <w:lvl w:ilvl="8">
+      <w:start w:val="1"/>
+      <w:numFmt w:val="none"/>
+      <w:suff w:val="nothing"/>
+      <w:lvlText w:val=""/>
+      <w:lvlJc w:val="left"/>
+      <w:pPr>
+        <w:tabs>
+          <w:tab w:val="num" w:pos="0"/>
+        </w:tabs>
+        <w:ind w:left="0" w:hanging="0"/>
       </w:pPr>
     </w:lvl>
   </w:abstractNum>
   <w:num w:numId="1">
-    <w:abstractNumId w:val="0"/>
+    <w:abstractNumId w:val="1"/>
+  </w:num>
+  <w:num w:numId="2">
+    <w:abstractNumId w:val="2"/>
   </w:num>
 </w:numbering>
 </file>
 
 <file path=word/styles.xml><?xml version="1.0" encoding="utf-8"?>
-<w:styles xmlns:mc="http://schemas.openxmlformats.org/markup-compatibility/2006" xmlns:r="http://schemas.openxmlformats.org/officeDocument/2006/relationships" xmlns:w="http://schemas.openxmlformats.org/wordprocessingml/2006/main" xmlns:w14="http://schemas.microsoft.com/office/word/2010/wordml" xmlns:w15="http://schemas.microsoft.com/office/word/2012/wordml" xmlns:w16cex="http://schemas.microsoft.com/office/word/2018/wordml/cex" xmlns:w16cid="http://schemas.microsoft.com/office/word/2016/wordml/cid" xmlns:w16="http://schemas.microsoft.com/office/word/2018/wordml" xmlns:w16sdtdh="http://schemas.microsoft.com/office/word/2020/wordml/sdtdatahash" xmlns:w16se="http://schemas.microsoft.com/office/word/2015/wordml/symex" mc:Ignorable="w14 w15 w16se w16cid w16 w16cex w16sdtdh">
+<w:styles xmlns:w="http://schemas.openxmlformats.org/wordprocessingml/2006/main" xmlns:w14="http://schemas.microsoft.com/office/word/2010/wordml" xmlns:mc="http://schemas.openxmlformats.org/markup-compatibility/2006" mc:Ignorable="w14">
   <w:docDefaults>
     <w:rPrDefault>
       <w:rPr>
-        <w:rFonts w:ascii="Times New Roman" w:eastAsia="Times New Roman" w:hAnsi="Times New Roman" w:cs="Times New Roman"/>
+        <w:rFonts w:ascii="Times New Roman" w:hAnsi="Times New Roman" w:eastAsia="Times New Roman" w:cs="Times New Roman"/>
         <w:lang w:val="en-US" w:eastAsia="en-US" w:bidi="ar-SA"/>
       </w:rPr>
     </w:rPrDefault>
-    <w:pPrDefault/>
+    <w:pPrDefault>
+      <w:pPr>
+        <w:suppressAutoHyphens w:val="true"/>
+      </w:pPr>
+    </w:pPrDefault>
   </w:docDefaults>
   <w:latentStyles w:defLockedState="0" w:defUIPriority="99" w:defSemiHidden="0" w:defUnhideWhenUsed="0" w:defQFormat="0" w:count="376">
     <w:lsdException w:name="Normal" w:uiPriority="0" w:qFormat="1"/>
     <w:lsdException w:name="heading 1" w:uiPriority="9" w:qFormat="1"/>
-    <w:lsdException w:name="heading 2" w:semiHidden="1" w:uiPriority="9" w:unhideWhenUsed="1" w:qFormat="1"/>
-    <w:lsdException w:name="heading 3" w:semiHidden="1" w:uiPriority="9" w:unhideWhenUsed="1" w:qFormat="1"/>
-    <w:lsdException w:name="heading 4" w:semiHidden="1" w:uiPriority="9" w:unhideWhenUsed="1" w:qFormat="1"/>
-    <w:lsdException w:name="heading 5" w:semiHidden="1" w:uiPriority="9" w:unhideWhenUsed="1" w:qFormat="1"/>
-    <w:lsdException w:name="heading 6" w:semiHidden="1" w:uiPriority="9" w:unhideWhenUsed="1" w:qFormat="1"/>
-    <w:lsdException w:name="heading 7" w:semiHidden="1" w:uiPriority="9" w:unhideWhenUsed="1" w:qFormat="1"/>
-    <w:lsdException w:name="heading 8" w:semiHidden="1" w:uiPriority="9" w:unhideWhenUsed="1" w:qFormat="1"/>
-    <w:lsdException w:name="heading 9" w:semiHidden="1" w:uiPriority="9" w:unhideWhenUsed="1" w:qFormat="1"/>
+    <w:lsdException w:name="heading 2" w:uiPriority="9" w:semiHidden="1" w:unhideWhenUsed="1" w:qFormat="1"/>
+    <w:lsdException w:name="heading 3" w:uiPriority="9" w:semiHidden="1" w:unhideWhenUsed="1" w:qFormat="1"/>
+    <w:lsdException w:name="heading 4" w:uiPriority="9" w:semiHidden="1" w:unhideWhenUsed="1" w:qFormat="1"/>
+    <w:lsdException w:name="heading 5" w:uiPriority="9" w:semiHidden="1" w:unhideWhenUsed="1" w:qFormat="1"/>
+    <w:lsdException w:name="heading 6" w:uiPriority="9" w:semiHidden="1" w:unhideWhenUsed="1" w:qFormat="1"/>
+    <w:lsdException w:name="heading 7" w:uiPriority="9" w:semiHidden="1" w:unhideWhenUsed="1" w:qFormat="1"/>
+    <w:lsdException w:name="heading 8" w:uiPriority="9" w:semiHidden="1" w:unhideWhenUsed="1" w:qFormat="1"/>
+    <w:lsdException w:name="heading 9" w:uiPriority="9" w:semiHidden="1" w:unhideWhenUsed="1" w:qFormat="1"/>
     <w:lsdException w:name="index 1" w:semiHidden="1" w:unhideWhenUsed="1"/>
     <w:lsdException w:name="index 2" w:semiHidden="1" w:unhideWhenUsed="1"/>
     <w:lsdException w:name="index 3" w:semiHidden="1" w:unhideWhenUsed="1"/>
@@ -365,15 +405,15 @@
     <w:lsdException w:name="index 7" w:semiHidden="1" w:unhideWhenUsed="1"/>
     <w:lsdException w:name="index 8" w:semiHidden="1" w:unhideWhenUsed="1"/>
     <w:lsdException w:name="index 9" w:semiHidden="1" w:unhideWhenUsed="1"/>
-    <w:lsdException w:name="toc 1" w:semiHidden="1" w:uiPriority="39" w:unhideWhenUsed="1"/>
-    <w:lsdException w:name="toc 2" w:semiHidden="1" w:uiPriority="39" w:unhideWhenUsed="1"/>
-    <w:lsdException w:name="toc 3" w:semiHidden="1" w:uiPriority="39" w:unhideWhenUsed="1"/>
-    <w:lsdException w:name="toc 4" w:semiHidden="1" w:uiPriority="39" w:unhideWhenUsed="1"/>
-    <w:lsdException w:name="toc 5" w:semiHidden="1" w:uiPriority="39" w:unhideWhenUsed="1"/>
-    <w:lsdException w:name="toc 6" w:semiHidden="1" w:uiPriority="39" w:unhideWhenUsed="1"/>
-    <w:lsdException w:name="toc 7" w:semiHidden="1" w:uiPriority="39" w:unhideWhenUsed="1"/>
-    <w:lsdException w:name="toc 8" w:semiHidden="1" w:uiPriority="39" w:unhideWhenUsed="1"/>
-    <w:lsdException w:name="toc 9" w:semiHidden="1" w:uiPriority="39" w:unhideWhenUsed="1"/>
+    <w:lsdException w:name="toc 1" w:uiPriority="39" w:semiHidden="1" w:unhideWhenUsed="1"/>
+    <w:lsdException w:name="toc 2" w:uiPriority="39" w:semiHidden="1" w:unhideWhenUsed="1"/>
+    <w:lsdException w:name="toc 3" w:uiPriority="39" w:semiHidden="1" w:unhideWhenUsed="1"/>
+    <w:lsdException w:name="toc 4" w:uiPriority="39" w:semiHidden="1" w:unhideWhenUsed="1"/>
+    <w:lsdException w:name="toc 5" w:uiPriority="39" w:semiHidden="1" w:unhideWhenUsed="1"/>
+    <w:lsdException w:name="toc 6" w:uiPriority="39" w:semiHidden="1" w:unhideWhenUsed="1"/>
+    <w:lsdException w:name="toc 7" w:uiPriority="39" w:semiHidden="1" w:unhideWhenUsed="1"/>
+    <w:lsdException w:name="toc 8" w:uiPriority="39" w:semiHidden="1" w:unhideWhenUsed="1"/>
+    <w:lsdException w:name="toc 9" w:uiPriority="39" w:semiHidden="1" w:unhideWhenUsed="1"/>
     <w:lsdException w:name="Normal Indent" w:semiHidden="1" w:unhideWhenUsed="1"/>
     <w:lsdException w:name="footnote text" w:semiHidden="1" w:unhideWhenUsed="1"/>
     <w:lsdException w:name="annotation text" w:semiHidden="1" w:unhideWhenUsed="1"/>
@@ -411,7 +451,7 @@
     <w:lsdException w:name="Title" w:uiPriority="10" w:qFormat="1"/>
     <w:lsdException w:name="Closing" w:semiHidden="1" w:unhideWhenUsed="1"/>
     <w:lsdException w:name="Signature" w:semiHidden="1" w:unhideWhenUsed="1"/>
-    <w:lsdException w:name="Default Paragraph Font" w:semiHidden="1" w:uiPriority="1" w:unhideWhenUsed="1"/>
+    <w:lsdException w:name="Default Paragraph Font" w:uiPriority="1" w:semiHidden="1" w:unhideWhenUsed="1"/>
     <w:lsdException w:name="Body Text" w:semiHidden="1" w:unhideWhenUsed="1"/>
     <w:lsdException w:name="Body Text Indent" w:semiHidden="1" w:unhideWhenUsed="1"/>
     <w:lsdException w:name="List Continue" w:semiHidden="1" w:unhideWhenUsed="1"/>
@@ -611,8 +651,8 @@
     <w:lsdException w:name="Subtle Reference" w:uiPriority="31" w:qFormat="1"/>
     <w:lsdException w:name="Intense Reference" w:uiPriority="32" w:qFormat="1"/>
     <w:lsdException w:name="Book Title" w:uiPriority="33" w:qFormat="1"/>
-    <w:lsdException w:name="Bibliography" w:semiHidden="1" w:uiPriority="37" w:unhideWhenUsed="1"/>
-    <w:lsdException w:name="TOC Heading" w:semiHidden="1" w:uiPriority="39" w:unhideWhenUsed="1" w:qFormat="1"/>
+    <w:lsdException w:name="Bibliography" w:uiPriority="37" w:semiHidden="1" w:unhideWhenUsed="1"/>
+    <w:lsdException w:name="TOC Heading" w:uiPriority="39" w:semiHidden="1" w:unhideWhenUsed="1" w:qFormat="1"/>
     <w:lsdException w:name="Plain Table 1" w:uiPriority="41"/>
     <w:lsdException w:name="Plain Table 2" w:uiPriority="42"/>
     <w:lsdException w:name="Plain Table 3" w:uiPriority="43"/>
@@ -723,16 +763,20 @@
     <w:lsdException w:name="Unresolved Mention" w:semiHidden="1" w:unhideWhenUsed="1"/>
     <w:lsdException w:name="Smart Link" w:semiHidden="1" w:unhideWhenUsed="1"/>
   </w:latentStyles>
-  <w:style w:type="paragraph" w:default="1" w:styleId="Normal">
+  <w:style w:type="paragraph" w:styleId="Normal" w:default="1">
     <w:name w:val="Normal"/>
     <w:qFormat/>
     <w:pPr>
-      <w:widowControl w:val="0"/>
-      <w:suppressAutoHyphens/>
+      <w:widowControl w:val="false"/>
+      <w:suppressAutoHyphens w:val="true"/>
+      <w:bidi w:val="0"/>
+      <w:spacing w:before="0" w:after="0"/>
+      <w:jc w:val="left"/>
     </w:pPr>
     <w:rPr>
-      <w:rFonts w:eastAsia="SimSun" w:cs="Arial"/>
-      <w:kern w:val="1"/>
+      <w:rFonts w:eastAsia="SimSun" w:cs="Arial" w:ascii="Times New Roman" w:hAnsi="Times New Roman"/>
+      <w:color w:val="auto"/>
+      <w:kern w:val="2"/>
       <w:sz w:val="24"/>
       <w:szCs w:val="24"/>
       <w:lang w:val="ru-RU" w:eastAsia="hi-IN" w:bidi="hi-IN"/>
@@ -745,71 +789,71 @@
     <w:qFormat/>
     <w:pPr>
       <w:numPr>
+        <w:ilvl w:val="0"/>
         <w:numId w:val="1"/>
       </w:numPr>
       <w:outlineLvl w:val="0"/>
     </w:pPr>
     <w:rPr>
-      <w:rFonts w:ascii="Times New Roman" w:eastAsia="SimSun" w:hAnsi="Times New Roman"/>
+      <w:rFonts w:ascii="Times New Roman" w:hAnsi="Times New Roman" w:eastAsia="SimSun"/>
       <w:b/>
       <w:bCs/>
       <w:sz w:val="48"/>
       <w:szCs w:val="48"/>
     </w:rPr>
   </w:style>
-  <w:style w:type="character" w:default="1" w:styleId="DefaultParagraphFont">
+  <w:style w:type="character" w:styleId="DefaultParagraphFont" w:default="1">
     <w:name w:val="Default Paragraph Font"/>
     <w:uiPriority w:val="1"/>
     <w:semiHidden/>
     <w:unhideWhenUsed/>
-  </w:style>
-  <w:style w:type="table" w:default="1" w:styleId="TableNormal">
-    <w:name w:val="Normal Table"/>
-    <w:uiPriority w:val="99"/>
-    <w:semiHidden/>
-    <w:unhideWhenUsed/>
-    <w:tblPr>
-      <w:tblInd w:w="0" w:type="dxa"/>
-      <w:tblCellMar>
-        <w:top w:w="0" w:type="dxa"/>
-        <w:left w:w="108" w:type="dxa"/>
-        <w:bottom w:w="0" w:type="dxa"/>
-        <w:right w:w="108" w:type="dxa"/>
-      </w:tblCellMar>
-    </w:tblPr>
-  </w:style>
-  <w:style w:type="numbering" w:default="1" w:styleId="NoList">
-    <w:name w:val="No List"/>
-    <w:uiPriority w:val="99"/>
-    <w:semiHidden/>
-    <w:unhideWhenUsed/>
-  </w:style>
-  <w:style w:type="character" w:customStyle="1" w:styleId="WW8Num1z0">
+    <w:qFormat/>
+    <w:rPr/>
+  </w:style>
+  <w:style w:type="character" w:styleId="WW8Num1z0" w:customStyle="1">
     <w:name w:val="WW8Num1z0"/>
-  </w:style>
-  <w:style w:type="character" w:customStyle="1" w:styleId="WW8Num1z1">
+    <w:qFormat/>
+    <w:rPr/>
+  </w:style>
+  <w:style w:type="character" w:styleId="WW8Num1z1" w:customStyle="1">
     <w:name w:val="WW8Num1z1"/>
-  </w:style>
-  <w:style w:type="character" w:customStyle="1" w:styleId="WW8Num1z2">
+    <w:qFormat/>
+    <w:rPr/>
+  </w:style>
+  <w:style w:type="character" w:styleId="WW8Num1z2" w:customStyle="1">
     <w:name w:val="WW8Num1z2"/>
-  </w:style>
-  <w:style w:type="character" w:customStyle="1" w:styleId="WW8Num1z3">
+    <w:qFormat/>
+    <w:rPr/>
+  </w:style>
+  <w:style w:type="character" w:styleId="WW8Num1z3" w:customStyle="1">
     <w:name w:val="WW8Num1z3"/>
-  </w:style>
-  <w:style w:type="character" w:customStyle="1" w:styleId="WW8Num1z4">
+    <w:qFormat/>
+    <w:rPr/>
+  </w:style>
+  <w:style w:type="character" w:styleId="WW8Num1z4" w:customStyle="1">
     <w:name w:val="WW8Num1z4"/>
-  </w:style>
-  <w:style w:type="character" w:customStyle="1" w:styleId="WW8Num1z5">
+    <w:qFormat/>
+    <w:rPr/>
+  </w:style>
+  <w:style w:type="character" w:styleId="WW8Num1z5" w:customStyle="1">
     <w:name w:val="WW8Num1z5"/>
-  </w:style>
-  <w:style w:type="character" w:customStyle="1" w:styleId="WW8Num1z6">
+    <w:qFormat/>
+    <w:rPr/>
+  </w:style>
+  <w:style w:type="character" w:styleId="WW8Num1z6" w:customStyle="1">
     <w:name w:val="WW8Num1z6"/>
-  </w:style>
-  <w:style w:type="character" w:customStyle="1" w:styleId="WW8Num1z7">
+    <w:qFormat/>
+    <w:rPr/>
+  </w:style>
+  <w:style w:type="character" w:styleId="WW8Num1z7" w:customStyle="1">
     <w:name w:val="WW8Num1z7"/>
-  </w:style>
-  <w:style w:type="character" w:customStyle="1" w:styleId="WW8Num1z8">
+    <w:qFormat/>
+    <w:rPr/>
+  </w:style>
+  <w:style w:type="character" w:styleId="WW8Num1z8" w:customStyle="1">
     <w:name w:val="WW8Num1z8"/>
+    <w:qFormat/>
+    <w:rPr/>
   </w:style>
   <w:style w:type="character" w:styleId="Strong">
     <w:name w:val="Strong"/>
@@ -824,22 +868,24 @@
     <w:rPr>
       <w:color w:val="000080"/>
       <w:u w:val="single"/>
-      <w:lang/>
     </w:rPr>
   </w:style>
-  <w:style w:type="character" w:customStyle="1" w:styleId="NumberingSymbols">
+  <w:style w:type="character" w:styleId="NumberingSymbols" w:customStyle="1">
     <w:name w:val="Numbering Symbols"/>
-  </w:style>
-  <w:style w:type="paragraph" w:customStyle="1" w:styleId="Heading">
+    <w:qFormat/>
+    <w:rPr/>
+  </w:style>
+  <w:style w:type="paragraph" w:styleId="Heading" w:customStyle="1">
     <w:name w:val="Heading"/>
     <w:basedOn w:val="Normal"/>
     <w:next w:val="BodyText"/>
+    <w:qFormat/>
     <w:pPr>
-      <w:keepNext/>
+      <w:keepNext w:val="true"/>
       <w:spacing w:before="240" w:after="120"/>
     </w:pPr>
     <w:rPr>
-      <w:rFonts w:ascii="Arial" w:eastAsia="Microsoft YaHei" w:hAnsi="Arial"/>
+      <w:rFonts w:ascii="Arial" w:hAnsi="Arial" w:eastAsia="Microsoft YaHei"/>
       <w:sz w:val="28"/>
       <w:szCs w:val="28"/>
     </w:rPr>
@@ -848,12 +894,15 @@
     <w:name w:val="Body Text"/>
     <w:basedOn w:val="Normal"/>
     <w:pPr>
-      <w:spacing w:after="120"/>
+      <w:spacing w:before="0" w:after="120"/>
     </w:pPr>
+    <w:rPr/>
   </w:style>
   <w:style w:type="paragraph" w:styleId="List">
     <w:name w:val="List"/>
     <w:basedOn w:val="BodyText"/>
+    <w:pPr/>
+    <w:rPr/>
   </w:style>
   <w:style w:type="paragraph" w:styleId="Caption">
     <w:name w:val="caption"/>
@@ -868,25 +917,48 @@
       <w:iCs/>
     </w:rPr>
   </w:style>
-  <w:style w:type="paragraph" w:customStyle="1" w:styleId="Index">
+  <w:style w:type="paragraph" w:styleId="Index" w:customStyle="1">
     <w:name w:val="Index"/>
     <w:basedOn w:val="Normal"/>
+    <w:qFormat/>
     <w:pPr>
       <w:suppressLineNumbers/>
     </w:pPr>
+    <w:rPr/>
+  </w:style>
+  <w:style w:type="numbering" w:styleId="NoList" w:default="1">
+    <w:name w:val="No List"/>
+    <w:uiPriority w:val="99"/>
+    <w:semiHidden/>
+    <w:unhideWhenUsed/>
+    <w:qFormat/>
+  </w:style>
+  <w:style w:type="table" w:default="1" w:styleId="TableNormal">
+    <w:name w:val="Normal Table"/>
+    <w:uiPriority w:val="99"/>
+    <w:semiHidden/>
+    <w:unhideWhenUsed/>
+    <w:tblPr>
+      <w:tblCellMar>
+        <w:top w:w="0" w:type="dxa"/>
+        <w:left w:w="108" w:type="dxa"/>
+        <w:bottom w:w="0" w:type="dxa"/>
+        <w:right w:w="108" w:type="dxa"/>
+      </w:tblCellMar>
+    </w:tblPr>
   </w:style>
 </w:styles>
 </file>
 
 <file path=word/theme/theme1.xml><?xml version="1.0" encoding="utf-8"?>
-<a:theme xmlns:a="http://schemas.openxmlformats.org/drawingml/2006/main" name="Office Theme">
+<a:theme xmlns:a="http://schemas.openxmlformats.org/drawingml/2006/main" xmlns:r="http://schemas.openxmlformats.org/officeDocument/2006/relationships" name="Office Theme">
   <a:themeElements>
     <a:clrScheme name="Office">
       <a:dk1>
-        <a:sysClr val="windowText" lastClr="000000"/>
+        <a:srgbClr val="000000"/>
       </a:dk1>
       <a:lt1>
-        <a:sysClr val="window" lastClr="FFFFFF"/>
+        <a:srgbClr val="FFFFFF"/>
       </a:lt1>
       <a:dk2>
         <a:srgbClr val="44546A"/>
@@ -921,153 +993,55 @@
     </a:clrScheme>
     <a:fontScheme name="Office">
       <a:majorFont>
-        <a:latin typeface="Calibri Light" panose="020F0302020204030204"/>
+        <a:latin typeface="Calibri Light" panose="020F0302020204030204" pitchFamily="0" charset="1"/>
         <a:ea typeface=""/>
         <a:cs typeface=""/>
-        <a:font script="Jpan" typeface="游ゴシック Light"/>
-        <a:font script="Hang" typeface="맑은 고딕"/>
-        <a:font script="Hans" typeface="等线 Light"/>
-        <a:font script="Hant" typeface="新細明體"/>
-        <a:font script="Arab" typeface="Times New Roman"/>
-        <a:font script="Hebr" typeface="Times New Roman"/>
-        <a:font script="Thai" typeface="Angsana New"/>
-        <a:font script="Ethi" typeface="Nyala"/>
-        <a:font script="Beng" typeface="Vrinda"/>
-        <a:font script="Gujr" typeface="Shruti"/>
-        <a:font script="Khmr" typeface="MoolBoran"/>
-        <a:font script="Knda" typeface="Tunga"/>
-        <a:font script="Guru" typeface="Raavi"/>
-        <a:font script="Cans" typeface="Euphemia"/>
-        <a:font script="Cher" typeface="Plantagenet Cherokee"/>
-        <a:font script="Yiii" typeface="Microsoft Yi Baiti"/>
-        <a:font script="Tibt" typeface="Microsoft Himalaya"/>
-        <a:font script="Thaa" typeface="MV Boli"/>
-        <a:font script="Deva" typeface="Mangal"/>
-        <a:font script="Telu" typeface="Gautami"/>
-        <a:font script="Taml" typeface="Latha"/>
-        <a:font script="Syrc" typeface="Estrangelo Edessa"/>
-        <a:font script="Orya" typeface="Kalinga"/>
-        <a:font script="Mlym" typeface="Kartika"/>
-        <a:font script="Laoo" typeface="DokChampa"/>
-        <a:font script="Sinh" typeface="Iskoola Pota"/>
-        <a:font script="Mong" typeface="Mongolian Baiti"/>
-        <a:font script="Viet" typeface="Times New Roman"/>
-        <a:font script="Uigh" typeface="Microsoft Uighur"/>
-        <a:font script="Geor" typeface="Sylfaen"/>
-        <a:font script="Armn" typeface="Arial"/>
-        <a:font script="Bugi" typeface="Leelawadee UI"/>
-        <a:font script="Bopo" typeface="Microsoft JhengHei"/>
-        <a:font script="Java" typeface="Javanese Text"/>
-        <a:font script="Lisu" typeface="Segoe UI"/>
-        <a:font script="Mymr" typeface="Myanmar Text"/>
-        <a:font script="Nkoo" typeface="Ebrima"/>
-        <a:font script="Olck" typeface="Nirmala UI"/>
-        <a:font script="Osma" typeface="Ebrima"/>
-        <a:font script="Phag" typeface="Phagspa"/>
-        <a:font script="Syrn" typeface="Estrangelo Edessa"/>
-        <a:font script="Syrj" typeface="Estrangelo Edessa"/>
-        <a:font script="Syre" typeface="Estrangelo Edessa"/>
-        <a:font script="Sora" typeface="Nirmala UI"/>
-        <a:font script="Tale" typeface="Microsoft Tai Le"/>
-        <a:font script="Talu" typeface="Microsoft New Tai Lue"/>
-        <a:font script="Tfng" typeface="Ebrima"/>
       </a:majorFont>
       <a:minorFont>
-        <a:latin typeface="Calibri" panose="020F0502020204030204"/>
+        <a:latin typeface="Calibri" panose="020F0502020204030204" pitchFamily="0" charset="1"/>
         <a:ea typeface=""/>
         <a:cs typeface=""/>
-        <a:font script="Jpan" typeface="游明朝"/>
-        <a:font script="Hang" typeface="맑은 고딕"/>
-        <a:font script="Hans" typeface="等线"/>
-        <a:font script="Hant" typeface="新細明體"/>
-        <a:font script="Arab" typeface="Arial"/>
-        <a:font script="Hebr" typeface="Arial"/>
-        <a:font script="Thai" typeface="Cordia New"/>
-        <a:font script="Ethi" typeface="Nyala"/>
-        <a:font script="Beng" typeface="Vrinda"/>
-        <a:font script="Gujr" typeface="Shruti"/>
-        <a:font script="Khmr" typeface="DaunPenh"/>
-        <a:font script="Knda" typeface="Tunga"/>
-        <a:font script="Guru" typeface="Raavi"/>
-        <a:font script="Cans" typeface="Euphemia"/>
-        <a:font script="Cher" typeface="Plantagenet Cherokee"/>
-        <a:font script="Yiii" typeface="Microsoft Yi Baiti"/>
-        <a:font script="Tibt" typeface="Microsoft Himalaya"/>
-        <a:font script="Thaa" typeface="MV Boli"/>
-        <a:font script="Deva" typeface="Mangal"/>
-        <a:font script="Telu" typeface="Gautami"/>
-        <a:font script="Taml" typeface="Latha"/>
-        <a:font script="Syrc" typeface="Estrangelo Edessa"/>
-        <a:font script="Orya" typeface="Kalinga"/>
-        <a:font script="Mlym" typeface="Kartika"/>
-        <a:font script="Laoo" typeface="DokChampa"/>
-        <a:font script="Sinh" typeface="Iskoola Pota"/>
-        <a:font script="Mong" typeface="Mongolian Baiti"/>
-        <a:font script="Viet" typeface="Arial"/>
-        <a:font script="Uigh" typeface="Microsoft Uighur"/>
-        <a:font script="Geor" typeface="Sylfaen"/>
-        <a:font script="Armn" typeface="Arial"/>
-        <a:font script="Bugi" typeface="Leelawadee UI"/>
-        <a:font script="Bopo" typeface="Microsoft JhengHei"/>
-        <a:font script="Java" typeface="Javanese Text"/>
-        <a:font script="Lisu" typeface="Segoe UI"/>
-        <a:font script="Mymr" typeface="Myanmar Text"/>
-        <a:font script="Nkoo" typeface="Ebrima"/>
-        <a:font script="Olck" typeface="Nirmala UI"/>
-        <a:font script="Osma" typeface="Ebrima"/>
-        <a:font script="Phag" typeface="Phagspa"/>
-        <a:font script="Syrn" typeface="Estrangelo Edessa"/>
-        <a:font script="Syrj" typeface="Estrangelo Edessa"/>
-        <a:font script="Syre" typeface="Estrangelo Edessa"/>
-        <a:font script="Sora" typeface="Nirmala UI"/>
-        <a:font script="Tale" typeface="Microsoft Tai Le"/>
-        <a:font script="Talu" typeface="Microsoft New Tai Lue"/>
-        <a:font script="Tfng" typeface="Ebrima"/>
       </a:minorFont>
     </a:fontScheme>
-    <a:fmtScheme name="Office">
+    <a:fmtScheme>
       <a:fillStyleLst>
         <a:solidFill>
           <a:schemeClr val="phClr"/>
         </a:solidFill>
-        <a:gradFill rotWithShape="1">
+        <a:gradFill>
           <a:gsLst>
             <a:gs pos="0">
               <a:schemeClr val="phClr">
                 <a:lumMod val="110000"/>
-                <a:satMod val="105000"/>
                 <a:tint val="67000"/>
               </a:schemeClr>
             </a:gs>
             <a:gs pos="50000">
               <a:schemeClr val="phClr">
                 <a:lumMod val="105000"/>
-                <a:satMod val="103000"/>
                 <a:tint val="73000"/>
               </a:schemeClr>
             </a:gs>
             <a:gs pos="100000">
               <a:schemeClr val="phClr">
                 <a:lumMod val="105000"/>
-                <a:satMod val="109000"/>
                 <a:tint val="81000"/>
               </a:schemeClr>
             </a:gs>
           </a:gsLst>
           <a:lin ang="5400000" scaled="0"/>
+          <a:tileRect l="0" t="0" r="0" b="0"/>
         </a:gradFill>
-        <a:gradFill rotWithShape="1">
+        <a:gradFill>
           <a:gsLst>
             <a:gs pos="0">
               <a:schemeClr val="phClr">
-                <a:satMod val="103000"/>
                 <a:lumMod val="102000"/>
                 <a:tint val="94000"/>
               </a:schemeClr>
             </a:gs>
             <a:gs pos="50000">
               <a:schemeClr val="phClr">
-                <a:satMod val="110000"/>
                 <a:lumMod val="100000"/>
                 <a:shade val="100000"/>
               </a:schemeClr>
@@ -1075,33 +1049,24 @@
             <a:gs pos="100000">
               <a:schemeClr val="phClr">
                 <a:lumMod val="99000"/>
-                <a:satMod val="120000"/>
                 <a:shade val="78000"/>
               </a:schemeClr>
             </a:gs>
           </a:gsLst>
           <a:lin ang="5400000" scaled="0"/>
+          <a:tileRect l="0" t="0" r="0" b="0"/>
         </a:gradFill>
       </a:fillStyleLst>
       <a:lnStyleLst>
         <a:ln w="6350" cap="flat" cmpd="sng" algn="ctr">
-          <a:solidFill>
-            <a:schemeClr val="phClr"/>
-          </a:solidFill>
           <a:prstDash val="solid"/>
           <a:miter lim="800000"/>
         </a:ln>
         <a:ln w="12700" cap="flat" cmpd="sng" algn="ctr">
-          <a:solidFill>
-            <a:schemeClr val="phClr"/>
-          </a:solidFill>
           <a:prstDash val="solid"/>
           <a:miter lim="800000"/>
         </a:ln>
         <a:ln w="19050" cap="flat" cmpd="sng" algn="ctr">
-          <a:solidFill>
-            <a:schemeClr val="phClr"/>
-          </a:solidFill>
           <a:prstDash val="solid"/>
           <a:miter lim="800000"/>
         </a:ln>
@@ -1114,13 +1079,7 @@
           <a:effectLst/>
         </a:effectStyle>
         <a:effectStyle>
-          <a:effectLst>
-            <a:outerShdw blurRad="57150" dist="19050" dir="5400000" algn="ctr" rotWithShape="0">
-              <a:srgbClr val="000000">
-                <a:alpha val="63000"/>
-              </a:srgbClr>
-            </a:outerShdw>
-          </a:effectLst>
+          <a:effectLst/>
         </a:effectStyle>
       </a:effectStyleLst>
       <a:bgFillStyleLst>
@@ -1130,15 +1089,13 @@
         <a:solidFill>
           <a:schemeClr val="phClr">
             <a:tint val="95000"/>
-            <a:satMod val="170000"/>
           </a:schemeClr>
         </a:solidFill>
-        <a:gradFill rotWithShape="1">
+        <a:gradFill>
           <a:gsLst>
             <a:gs pos="0">
               <a:schemeClr val="phClr">
                 <a:tint val="93000"/>
-                <a:satMod val="150000"/>
                 <a:shade val="98000"/>
                 <a:lumMod val="102000"/>
               </a:schemeClr>
@@ -1146,7 +1103,6 @@
             <a:gs pos="50000">
               <a:schemeClr val="phClr">
                 <a:tint val="98000"/>
-                <a:satMod val="130000"/>
                 <a:shade val="90000"/>
                 <a:lumMod val="103000"/>
               </a:schemeClr>
@@ -1154,21 +1110,14 @@
             <a:gs pos="100000">
               <a:schemeClr val="phClr">
                 <a:shade val="63000"/>
-                <a:satMod val="120000"/>
               </a:schemeClr>
             </a:gs>
           </a:gsLst>
           <a:lin ang="5400000" scaled="0"/>
+          <a:tileRect l="0" t="0" r="0" b="0"/>
         </a:gradFill>
       </a:bgFillStyleLst>
     </a:fmtScheme>
   </a:themeElements>
-  <a:objectDefaults/>
-  <a:extraClrSchemeLst/>
-  <a:extLst>
-    <a:ext uri="{05A4C25C-085E-4340-85A3-A5531E510DB2}">
-      <thm15:themeFamily xmlns:thm15="http://schemas.microsoft.com/office/thememl/2012/main" name="Office Theme" id="{62F939B6-93AF-4DB8-9C6B-D6C7DFDC589F}" vid="{4A3C46E8-61CC-4603-A589-7422A47A8E4A}"/>
-    </a:ext>
-  </a:extLst>
 </a:theme>
 </file>
</xml_diff>